<commit_message>
refactor: reestructurar espacio de trabajo, sincronizar Markdown con Word, resolver bug de métricas undefined en el tablero y habilitar equidad por edad
</commit_message>
<xml_diff>
--- a/paper/tables/anthropic/tab_resultados_h3.docx
+++ b/paper/tables/anthropic/tab_resultados_h3.docx
@@ -18,15 +18,17 @@
         <w:tblLook w:firstColumn="1" w:firstRow="1" w:lastColumn="0" w:lastRow="0" w:noHBand="0" w:noVBand="1" w:val="04A0"/>
       </w:tblPr>
       <w:tblGrid>
-        <w:gridCol w:w="2160"/>
-        <w:gridCol w:w="2160"/>
-        <w:gridCol w:w="2160"/>
-        <w:gridCol w:w="2160"/>
+        <w:gridCol w:w="1440"/>
+        <w:gridCol w:w="1440"/>
+        <w:gridCol w:w="1440"/>
+        <w:gridCol w:w="1440"/>
+        <w:gridCol w:w="1440"/>
+        <w:gridCol w:w="1440"/>
       </w:tblGrid>
       <w:tr>
         <w:tc>
           <w:tcPr>
-            <w:tcW w:type="dxa" w:w="2160"/>
+            <w:tcW w:type="dxa" w:w="1440"/>
           </w:tcPr>
           <w:p>
             <w:pPr>
@@ -42,7 +44,7 @@
         </w:tc>
         <w:tc>
           <w:tcPr>
-            <w:tcW w:type="dxa" w:w="2160"/>
+            <w:tcW w:type="dxa" w:w="1440"/>
           </w:tcPr>
           <w:p>
             <w:pPr>
@@ -58,7 +60,7 @@
         </w:tc>
         <w:tc>
           <w:tcPr>
-            <w:tcW w:type="dxa" w:w="2160"/>
+            <w:tcW w:type="dxa" w:w="1440"/>
           </w:tcPr>
           <w:p>
             <w:pPr>
@@ -74,7 +76,39 @@
         </w:tc>
         <w:tc>
           <w:tcPr>
-            <w:tcW w:type="dxa" w:w="2160"/>
+            <w:tcW w:type="dxa" w:w="1440"/>
+          </w:tcPr>
+          <w:p>
+            <w:pPr>
+              <w:jc w:val="center"/>
+            </w:pPr>
+            <w:r>
+              <w:rPr>
+                <w:b/>
+              </w:rPr>
+              <w:t>DIR (edad)</w:t>
+            </w:r>
+          </w:p>
+        </w:tc>
+        <w:tc>
+          <w:tcPr>
+            <w:tcW w:type="dxa" w:w="1440"/>
+          </w:tcPr>
+          <w:p>
+            <w:pPr>
+              <w:jc w:val="center"/>
+            </w:pPr>
+            <w:r>
+              <w:rPr>
+                <w:b/>
+              </w:rPr>
+              <w:t>SPD (edad)</w:t>
+            </w:r>
+          </w:p>
+        </w:tc>
+        <w:tc>
+          <w:tcPr>
+            <w:tcW w:type="dxa" w:w="1440"/>
           </w:tcPr>
           <w:p>
             <w:pPr>
@@ -92,7 +126,7 @@
       <w:tr>
         <w:tc>
           <w:tcPr>
-            <w:tcW w:type="dxa" w:w="2160"/>
+            <w:tcW w:type="dxa" w:w="1440"/>
           </w:tcPr>
           <w:p>
             <w:pPr>
@@ -105,7 +139,7 @@
         </w:tc>
         <w:tc>
           <w:tcPr>
-            <w:tcW w:type="dxa" w:w="2160"/>
+            <w:tcW w:type="dxa" w:w="1440"/>
           </w:tcPr>
           <w:p>
             <w:pPr>
@@ -118,7 +152,7 @@
         </w:tc>
         <w:tc>
           <w:tcPr>
-            <w:tcW w:type="dxa" w:w="2160"/>
+            <w:tcW w:type="dxa" w:w="1440"/>
           </w:tcPr>
           <w:p>
             <w:pPr>
@@ -131,7 +165,33 @@
         </w:tc>
         <w:tc>
           <w:tcPr>
-            <w:tcW w:type="dxa" w:w="2160"/>
+            <w:tcW w:type="dxa" w:w="1440"/>
+          </w:tcPr>
+          <w:p>
+            <w:pPr>
+              <w:jc w:val="center"/>
+            </w:pPr>
+            <w:r>
+              <w:t>0.773</w:t>
+            </w:r>
+          </w:p>
+        </w:tc>
+        <w:tc>
+          <w:tcPr>
+            <w:tcW w:type="dxa" w:w="1440"/>
+          </w:tcPr>
+          <w:p>
+            <w:pPr>
+              <w:jc w:val="center"/>
+            </w:pPr>
+            <w:r>
+              <w:t>-0.050</w:t>
+            </w:r>
+          </w:p>
+        </w:tc>
+        <w:tc>
+          <w:tcPr>
+            <w:tcW w:type="dxa" w:w="1440"/>
           </w:tcPr>
           <w:p>
             <w:pPr>
@@ -146,7 +206,7 @@
       <w:tr>
         <w:tc>
           <w:tcPr>
-            <w:tcW w:type="dxa" w:w="2160"/>
+            <w:tcW w:type="dxa" w:w="1440"/>
           </w:tcPr>
           <w:p>
             <w:pPr>
@@ -159,7 +219,7 @@
         </w:tc>
         <w:tc>
           <w:tcPr>
-            <w:tcW w:type="dxa" w:w="2160"/>
+            <w:tcW w:type="dxa" w:w="1440"/>
           </w:tcPr>
           <w:p>
             <w:pPr>
@@ -172,7 +232,7 @@
         </w:tc>
         <w:tc>
           <w:tcPr>
-            <w:tcW w:type="dxa" w:w="2160"/>
+            <w:tcW w:type="dxa" w:w="1440"/>
           </w:tcPr>
           <w:p>
             <w:pPr>
@@ -185,7 +245,33 @@
         </w:tc>
         <w:tc>
           <w:tcPr>
-            <w:tcW w:type="dxa" w:w="2160"/>
+            <w:tcW w:type="dxa" w:w="1440"/>
+          </w:tcPr>
+          <w:p>
+            <w:pPr>
+              <w:jc w:val="center"/>
+            </w:pPr>
+            <w:r>
+              <w:t>0.727</w:t>
+            </w:r>
+          </w:p>
+        </w:tc>
+        <w:tc>
+          <w:tcPr>
+            <w:tcW w:type="dxa" w:w="1440"/>
+          </w:tcPr>
+          <w:p>
+            <w:pPr>
+              <w:jc w:val="center"/>
+            </w:pPr>
+            <w:r>
+              <w:t>-0.060</w:t>
+            </w:r>
+          </w:p>
+        </w:tc>
+        <w:tc>
+          <w:tcPr>
+            <w:tcW w:type="dxa" w:w="1440"/>
           </w:tcPr>
           <w:p>
             <w:pPr>
@@ -204,7 +290,7 @@
           <w:i/>
           <w:sz w:val="20"/>
         </w:rPr>
-        <w:t>Nota. DIR = Disparate Impact Ratio (umbral EEOC: ≥ 0.80). SPD = Statistical Parity Difference (ideal: 0). Grupo protegido: género (M/F). C2 sin anonimización vs C3 con anonimización PII.</w:t>
+        <w:t>Nota. DIR = Disparate Impact Ratio (umbral EEOC: ≥ 0.80). SPD = Statistical Parity Difference (ideal: 0). Grupos evaluados: género (F vs M) y edad (36-58 vs 23-35). C2 sin anonimización vs C3 con anonimización PII.</w:t>
       </w:r>
     </w:p>
     <w:sectPr>

</xml_diff>